<commit_message>
PRD: sesuaikan skenario demonstrasi dengan prototipe
- Skenario 1: likuiditas dan kualitas aset kuning pada September
- Skenario 3: layar Ekspor CSV/JSON
- Skenario 4: penarikan Rp1,5 juta dan beban Rp12 juta, skor 36, TK-016
- Tambah skenario 6 (Pengingat dan saldo) dan 7 (halaman depan)
- Koreksi paragraf Pengujian
</commit_message>
<xml_diff>
--- a/PRD TERANG-KOP.docx
+++ b/PRD TERANG-KOP.docx
@@ -13,13 +13,7 @@
     <w:p>
       <w:pPr/>
       <w:r>
-        <w:t xml:space="preserve">Oct 15, 2026</w:t>
-      </w:r>
-      <w:r>
-        <w:t xml:space="preserve"> · </w:t>
-      </w:r>
-      <w:r>
-        <w:t xml:space="preserve">@tred</w:t>
+        <w:t xml:space="preserve">Oct 15, 2026 · @tred</w:t>
       </w:r>
     </w:p>
     <w:p>
@@ -6527,18 +6521,18 @@
           <w:p>
             <w:pPr/>
             <w:r>
-              <w:t xml:space="preserve">Anggota melihat status Waspada; pengurus mencatat angsuran peminjam yang menunggak (luring, lalu sinkron); tutup buku; pengawas mengesahkan</w:t>
-            </w:r>
-          </w:p>
-        </w:tc>
-        <w:tc>
-          <w:tcPr>
-            <w:tcW w:w="3120" w:type="dxa"/>
-          </w:tcPr>
-          <w:p>
-            <w:pPr/>
-            <w:r>
-              <w:t xml:space="preserve">Penutupan September: skor 78, Waspada. Pratinjau Oktober sebelum penagihan: skor 70, status Perlu tindakan karena dua indikator merah. Setelah penagihan: skor 94, Sehat</w:t>
+              <w:t xml:space="preserve">Anggota melihat status Waspada September; pengurus mencatat angsuran PJ-04 dan PJ-06 yang menunggak (luring, lalu sinkron); tutup buku Oktober; pengawas mengesahkan</w:t>
+            </w:r>
+          </w:p>
+        </w:tc>
+        <w:tc>
+          <w:tcPr>
+            <w:tcW w:w="3120" w:type="dxa"/>
+          </w:tcPr>
+          <w:p>
+            <w:pPr/>
+            <w:r>
+              <w:t xml:space="preserve">Penutupan September: skor 78, Waspada, dengan likuiditas kuning (0,97) setelah pelunasan dipercepat utang bank dan kualitas aset kuning (6,9%). Pratinjau Oktober sebelum penagihan: skor 70, status Perlu tindakan karena dua indikator merah (perlindungan dan kualitas aset). Setelah penagihan: skor 94, Sehat; tiket Pendampingan September tetap menunggu penutupan oleh pendamping</w:t>
             </w:r>
           </w:p>
         </w:tc>
@@ -6597,18 +6591,18 @@
           <w:p>
             <w:pPr/>
             <w:r>
-              <w:t xml:space="preserve">Dinas membuka 30 koperasi, papan KPI, dan Hitung ulang Sukamaju</w:t>
-            </w:r>
-          </w:p>
-        </w:tc>
-        <w:tc>
-          <w:tcPr>
-            <w:tcW w:w="3120" w:type="dxa"/>
-          </w:tcPr>
-          <w:p>
-            <w:pPr/>
-            <w:r>
-              <w:t xml:space="preserve">Hasil hitung ulang sama dengan semua periode tersimpan</w:t>
+              <w:t xml:space="preserve">Dinas membuka 30 koperasi, papan KPI, Hitung ulang Sukamaju, dan layar Ekspor</w:t>
+            </w:r>
+          </w:p>
+        </w:tc>
+        <w:tc>
+          <w:tcPr>
+            <w:tcW w:w="3120" w:type="dxa"/>
+          </w:tcPr>
+          <w:p>
+            <w:pPr/>
+            <w:r>
+              <w:t xml:space="preserve">Hasil hitung ulang sama dengan semua periode tersimpan; empat set data (wilayah, skor bulanan, tiket, buku besar) dapat diunduh sebagai CSV dan JSON</w:t>
             </w:r>
           </w:p>
         </w:tc>
@@ -6632,18 +6626,18 @@
           <w:p>
             <w:pPr/>
             <w:r>
-              <w:t xml:space="preserve">Pengurus mencatat beban Rp14 juta</w:t>
-            </w:r>
-          </w:p>
-        </w:tc>
-        <w:tc>
-          <w:tcPr>
-            <w:tcW w:w="3120" w:type="dxa"/>
-          </w:tcPr>
-          <w:p>
-            <w:pPr/>
-            <w:r>
-              <w:t xml:space="preserve">Skor 32, Perlu tindakan; tiket TK-015 dengan tenggat 14 hari; ringkasan tampil di beranda anggota</w:t>
+              <w:t xml:space="preserve">Pengurus mencatat penarikan simpanan sukarela Rp1,5 juta dan beban operasional Rp12 juta, lalu tutup buku Oktober</w:t>
+            </w:r>
+          </w:p>
+        </w:tc>
+        <w:tc>
+          <w:tcPr>
+            <w:tcW w:w="3120" w:type="dxa"/>
+          </w:tcPr>
+          <w:p>
+            <w:pPr/>
+            <w:r>
+              <w:t xml:space="preserve">Skor 36, Perlu tindakan (lima indikator merah); tiket TK-016 Tindak lanjut dengan tenggat 14 hari; ringkasan tampil di beranda anggota</w:t>
             </w:r>
           </w:p>
         </w:tc>
@@ -6679,6 +6673,76 @@
             <w:pPr/>
             <w:r>
               <w:t xml:space="preserve">Pemeriksaan keutuhan menunjuk entri E0269 sebagai yang pertama tidak cocok; tombol pulihkan mengembalikan rantai</w:t>
+            </w:r>
+          </w:p>
+        </w:tc>
+      </w:tr>
+      <w:tr>
+        <w:tc>
+          <w:tcPr>
+            <w:tcW w:w="3120" w:type="dxa"/>
+          </w:tcPr>
+          <w:p>
+            <w:pPr/>
+            <w:r>
+              <w:t xml:space="preserve">6. Pengingat dan saldo</w:t>
+            </w:r>
+          </w:p>
+        </w:tc>
+        <w:tc>
+          <w:tcPr>
+            <w:tcW w:w="3120" w:type="dxa"/>
+          </w:tcPr>
+          <w:p>
+            <w:pPr/>
+            <w:r>
+              <w:t xml:space="preserve">Tanggal simulasi dimajukan ke 9 November tanpa laporan Oktober terbit; pengurus mencatat pengeluaran melebihi saldo kas</w:t>
+            </w:r>
+          </w:p>
+        </w:tc>
+        <w:tc>
+          <w:tcPr>
+            <w:tcW w:w="3120" w:type="dxa"/>
+          </w:tcPr>
+          <w:p>
+            <w:pPr/>
+            <w:r>
+              <w:t xml:space="preserve">Tiket Pengingat untuk pengurus (salinan pendamping) bertenggat 10 November dan bertanda Terlambat setelahnya; pengeluaran ditolak, atau berstatus Perlu ditinjau bila dicatat luring</w:t>
+            </w:r>
+          </w:p>
+        </w:tc>
+      </w:tr>
+      <w:tr>
+        <w:tc>
+          <w:tcPr>
+            <w:tcW w:w="3120" w:type="dxa"/>
+          </w:tcPr>
+          <w:p>
+            <w:pPr/>
+            <w:r>
+              <w:t xml:space="preserve">7. Halaman depan</w:t>
+            </w:r>
+          </w:p>
+        </w:tc>
+        <w:tc>
+          <w:tcPr>
+            <w:tcW w:w="3120" w:type="dxa"/>
+          </w:tcPr>
+          <w:p>
+            <w:pPr/>
+            <w:r>
+              <w:t xml:space="preserve">Pengunjung membuka halaman depan publik dan mencentang angsuran PJ-04 dan PJ-06 pada potongan skor</w:t>
+            </w:r>
+          </w:p>
+        </w:tc>
+        <w:tc>
+          <w:tcPr>
+            <w:tcW w:w="3120" w:type="dxa"/>
+          </w:tcPr>
+          <w:p>
+            <w:pPr/>
+            <w:r>
+              <w:t xml:space="preserve">Skor Oktober dihitung ulang dari buku besar dengan mesin yang sama, dari 70 Perlu tindakan menjadi 94 Sehat</w:t>
             </w:r>
           </w:p>
         </w:tc>
@@ -6695,7 +6759,7 @@
     <w:p>
       <w:pPr/>
       <w:r>
-        <w:t xml:space="preserve">Tiga skrip Playwright menjalankan semua layar dan alur di atas pada lebar desktop dan ponsel (termasuk tema gelap), dengan pemeriksaan tidak ada galat konsol dan tidak ada luapan horizontal. Semua lulus. Pengujian ini memeriksa perilaku prototipe, bukan kegunaan oleh pengurus sungguhan; uji kegunaan dengan pengguna nyata menjadi bagian fase pilot.</w:t>
+        <w:t xml:space="preserve">Skrip uji mesin (tests/engine-check.cjs) memeriksa angka skenario langsung dari buku besar, dan skrip Playwright (tests/ui-smoke.mjs) menjalankan halaman depan, semua layar, dan ketujuh alur di atas pada lebar desktop dan ponsel (termasuk tema gelap), dengan pemeriksaan tidak ada galat konsol dan tidak ada luapan horizontal. Semua lulus. Pengujian ini memeriksa perilaku prototipe, bukan kegunaan oleh pengurus sungguhan; uji kegunaan dengan pengguna nyata menjadi bagian fase pilot.</w:t>
       </w:r>
     </w:p>
     <w:p>

</xml_diff>